<commit_message>
Add: - Hoàn thành General và Specific của UC02
</commit_message>
<xml_diff>
--- a/specs/UC01-Start-Choose-language/UC01.docx
+++ b/specs/UC01-Start-Choose-language/UC01.docx
@@ -211,6 +211,14 @@
                 <w:lang w:val="en-US"/>
               </w:rPr>
             </w:pPr>
+            <w:r>
+              <w:rPr>
+                <w:rFonts w:asciiTheme="majorHAnsi" w:hAnsiTheme="majorHAnsi" w:cstheme="majorHAnsi"/>
+                <w:sz w:val="28"/>
+                <w:szCs w:val="28"/>
+              </w:rPr>
+              <w:t>Hoàn thiện (Standard)</w:t>
+            </w:r>
           </w:p>
         </w:tc>
       </w:tr>
@@ -2110,29 +2118,7 @@
                 <w:szCs w:val="28"/>
                 <w:lang w:val="en-US"/>
               </w:rPr>
-              <w:t>E</w:t>
-            </w:r>
-            <w:r>
-              <w:rPr>
-                <w:rFonts w:asciiTheme="majorHAnsi" w:hAnsiTheme="majorHAnsi" w:cstheme="majorHAnsi"/>
-                <w:b/>
-                <w:bCs/>
-                <w:sz w:val="28"/>
-                <w:szCs w:val="28"/>
-                <w:lang w:val="en-US"/>
-              </w:rPr>
-              <w:t>1</w:t>
-            </w:r>
-            <w:r>
-              <w:rPr>
-                <w:rFonts w:asciiTheme="majorHAnsi" w:hAnsiTheme="majorHAnsi" w:cstheme="majorHAnsi"/>
-                <w:b/>
-                <w:bCs/>
-                <w:sz w:val="28"/>
-                <w:szCs w:val="28"/>
-                <w:lang w:val="en-US"/>
-              </w:rPr>
-              <w:t xml:space="preserve">: </w:t>
+              <w:t xml:space="preserve">E1: </w:t>
             </w:r>
             <w:r>
               <w:rPr>
@@ -2897,34 +2883,7 @@
                 <w:szCs w:val="28"/>
                 <w:lang w:val="en-US"/>
               </w:rPr>
-              <w:t>Nếu thành công, q</w:t>
-            </w:r>
-            <w:r>
-              <w:rPr>
-                <w:rFonts w:asciiTheme="majorHAnsi" w:hAnsiTheme="majorHAnsi" w:cstheme="majorHAnsi"/>
-                <w:sz w:val="28"/>
-                <w:szCs w:val="28"/>
-                <w:lang w:val="en-US"/>
-              </w:rPr>
-              <w:t xml:space="preserve">uay lại bước </w:t>
-            </w:r>
-            <w:r>
-              <w:rPr>
-                <w:rFonts w:asciiTheme="majorHAnsi" w:hAnsiTheme="majorHAnsi" w:cstheme="majorHAnsi"/>
-                <w:sz w:val="28"/>
-                <w:szCs w:val="28"/>
-                <w:lang w:val="en-US"/>
-              </w:rPr>
-              <w:t>6</w:t>
-            </w:r>
-            <w:r>
-              <w:rPr>
-                <w:rFonts w:asciiTheme="majorHAnsi" w:hAnsiTheme="majorHAnsi" w:cstheme="majorHAnsi"/>
-                <w:sz w:val="28"/>
-                <w:szCs w:val="28"/>
-                <w:lang w:val="en-US"/>
-              </w:rPr>
-              <w:t xml:space="preserve"> của </w:t>
+              <w:t xml:space="preserve">Nếu thành công, quay lại bước 6 của </w:t>
             </w:r>
             <w:r>
               <w:rPr>
@@ -3061,34 +3020,7 @@
                 <w:szCs w:val="28"/>
                 <w:lang w:val="en-US"/>
               </w:rPr>
-              <w:t xml:space="preserve"> với ngôn ngữ mặc định được code cứng và q</w:t>
-            </w:r>
-            <w:r>
-              <w:rPr>
-                <w:rFonts w:asciiTheme="majorHAnsi" w:hAnsiTheme="majorHAnsi" w:cstheme="majorHAnsi"/>
-                <w:sz w:val="28"/>
-                <w:szCs w:val="28"/>
-                <w:lang w:val="en-US"/>
-              </w:rPr>
-              <w:t>uay lại bước 1</w:t>
-            </w:r>
-            <w:r>
-              <w:rPr>
-                <w:rFonts w:asciiTheme="majorHAnsi" w:hAnsiTheme="majorHAnsi" w:cstheme="majorHAnsi"/>
-                <w:sz w:val="28"/>
-                <w:szCs w:val="28"/>
-                <w:lang w:val="en-US"/>
-              </w:rPr>
-              <w:t xml:space="preserve">2 </w:t>
-            </w:r>
-            <w:r>
-              <w:rPr>
-                <w:rFonts w:asciiTheme="majorHAnsi" w:hAnsiTheme="majorHAnsi" w:cstheme="majorHAnsi"/>
-                <w:sz w:val="28"/>
-                <w:szCs w:val="28"/>
-                <w:lang w:val="en-US"/>
-              </w:rPr>
-              <w:t xml:space="preserve">của </w:t>
+              <w:t xml:space="preserve"> với ngôn ngữ mặc định được code cứng và quay lại bước 12 của </w:t>
             </w:r>
             <w:r>
               <w:rPr>
@@ -4079,18 +4011,7 @@
                 <w:lang w:val="en-US"/>
               </w:rPr>
               <w:lastRenderedPageBreak/>
-              <w:t>BR0</w:t>
-            </w:r>
-            <w:r>
-              <w:rPr>
-                <w:rFonts w:asciiTheme="majorHAnsi" w:hAnsiTheme="majorHAnsi" w:cstheme="majorHAnsi"/>
-                <w:b/>
-                <w:bCs/>
-                <w:sz w:val="28"/>
-                <w:szCs w:val="28"/>
-                <w:lang w:val="en-US"/>
-              </w:rPr>
-              <w:t>2</w:t>
+              <w:t>BR02</w:t>
             </w:r>
           </w:p>
         </w:tc>
@@ -4203,18 +4124,7 @@
                 <w:szCs w:val="28"/>
                 <w:lang w:val="en-US"/>
               </w:rPr>
-              <w:t>BR0</w:t>
-            </w:r>
-            <w:r>
-              <w:rPr>
-                <w:rFonts w:asciiTheme="majorHAnsi" w:hAnsiTheme="majorHAnsi" w:cstheme="majorHAnsi"/>
-                <w:b/>
-                <w:bCs/>
-                <w:sz w:val="28"/>
-                <w:szCs w:val="28"/>
-                <w:lang w:val="en-US"/>
-              </w:rPr>
-              <w:t>3</w:t>
+              <w:t>BR03</w:t>
             </w:r>
           </w:p>
         </w:tc>
@@ -4316,18 +4226,7 @@
                 <w:szCs w:val="28"/>
                 <w:lang w:val="en-US"/>
               </w:rPr>
-              <w:t>BR0</w:t>
-            </w:r>
-            <w:r>
-              <w:rPr>
-                <w:rFonts w:asciiTheme="majorHAnsi" w:hAnsiTheme="majorHAnsi" w:cstheme="majorHAnsi"/>
-                <w:b/>
-                <w:bCs/>
-                <w:sz w:val="28"/>
-                <w:szCs w:val="28"/>
-                <w:lang w:val="en-US"/>
-              </w:rPr>
-              <w:t>4</w:t>
+              <w:t>BR04</w:t>
             </w:r>
           </w:p>
         </w:tc>
@@ -4411,18 +4310,7 @@
                 <w:szCs w:val="28"/>
                 <w:lang w:val="en-US"/>
               </w:rPr>
-              <w:t>BR0</w:t>
-            </w:r>
-            <w:r>
-              <w:rPr>
-                <w:rFonts w:asciiTheme="majorHAnsi" w:hAnsiTheme="majorHAnsi" w:cstheme="majorHAnsi"/>
-                <w:b/>
-                <w:bCs/>
-                <w:sz w:val="28"/>
-                <w:szCs w:val="28"/>
-                <w:lang w:val="en-US"/>
-              </w:rPr>
-              <w:t>5</w:t>
+              <w:t>BR05</w:t>
             </w:r>
           </w:p>
         </w:tc>

</xml_diff>